<commit_message>
Temrin bölümlerindeki ifade ve şablon düzeltmeleri
Kılavuz (TEMRIN_1_1_2.docx):
- 1. bölümdeki tanım cümlesi düzeltildi, "öğrenim/öğrenme kazanımı" birliği sağlandı
- 2. bölüm başlığı içerikle uyumlu hâle getirildi
- Yeterlilik listesindeki son madde ile açıklama cümlesi ayrıldı
- Şablona "Öğrenme Kazanımı" alanı ve öğrenci/öğretmen imza alanı eklendi
- Tespitler sütunu genişletildi
- Bilgi bölümüne tablo satırlarının nasıl doldurulacağı eklendi
- Modül not fişi içeriği değiştirilmedi (yalnızca yeni sayfadan başlatıldı)

Örnek temrin sayfası (TEMRIN_SAYFASI_ORNEK.docx):
- Malzeme listesine Python 3 yorumlayıcısı eklendi
- Test satırıyla çakışan değerlendirme satırı daraltıldı
- Tespitler sütunu genişletildi, satırlar metni kırpmayacak şekilde ayarlandı

Co-Authored-By: Claude Opus 5.5 <noreply@anthropic.com>
Claude-Session: https://claude.ai/code/session_01M838Q3VuRWV5F562yoefrk
</commit_message>
<xml_diff>
--- a/belgeler/TEMRIN_1_1_2.docx
+++ b/belgeler/TEMRIN_1_1_2.docx
@@ -48,7 +48,7 @@
           <w:sz w:val="24"/>
           <w:szCs w:val="24"/>
         </w:rPr>
-        <w:t>temrin</w:t>
+        <w:t xml:space="preserve">temrin</w:t>
       </w:r>
       <w:r>
         <w:rPr>
@@ -56,98 +56,7 @@
           <w:sz w:val="24"/>
           <w:szCs w:val="24"/>
         </w:rPr>
-        <w:t xml:space="preserve">, öğrencilerin teorik olarak </w:t>
-      </w:r>
-      <w:r>
-        <w:rPr>
-          <w:rFonts w:ascii="Times New Roman" w:hAnsi="Times New Roman" w:cs="Times New Roman"/>
-          <w:sz w:val="24"/>
-          <w:szCs w:val="24"/>
-        </w:rPr>
-        <w:t>öğren</w:t>
-      </w:r>
-      <w:r>
-        <w:rPr>
-          <w:rFonts w:ascii="Times New Roman" w:hAnsi="Times New Roman" w:cs="Times New Roman"/>
-          <w:sz w:val="24"/>
-          <w:szCs w:val="24"/>
-        </w:rPr>
-        <w:t xml:space="preserve">dikleri bilgileri pratiğe dökmeleri, el becerilerini geliştirmeleri ve mesleki </w:t>
-      </w:r>
-      <w:r>
-        <w:rPr>
-          <w:rFonts w:ascii="Times New Roman" w:hAnsi="Times New Roman" w:cs="Times New Roman"/>
-          <w:sz w:val="24"/>
-          <w:szCs w:val="24"/>
-        </w:rPr>
-        <w:t xml:space="preserve">yetkinlik </w:t>
-      </w:r>
-      <w:r>
-        <w:rPr>
-          <w:rFonts w:ascii="Times New Roman" w:hAnsi="Times New Roman" w:cs="Times New Roman"/>
-          <w:sz w:val="24"/>
-          <w:szCs w:val="24"/>
-        </w:rPr>
-        <w:t xml:space="preserve">kazanmaları amacıyla atölye </w:t>
-      </w:r>
-      <w:r>
-        <w:rPr>
-          <w:rFonts w:ascii="Times New Roman" w:hAnsi="Times New Roman" w:cs="Times New Roman"/>
-          <w:color w:val="4472C4" w:themeColor="accent1"/>
-          <w:sz w:val="24"/>
-          <w:szCs w:val="24"/>
-        </w:rPr>
-        <w:t xml:space="preserve">  </w:t>
-      </w:r>
-      <w:proofErr w:type="gramStart"/>
-      <w:r>
-        <w:rPr>
-          <w:rFonts w:ascii="Times New Roman" w:hAnsi="Times New Roman" w:cs="Times New Roman"/>
-          <w:sz w:val="24"/>
-          <w:szCs w:val="24"/>
-        </w:rPr>
-        <w:t>ortam</w:t>
-      </w:r>
-      <w:r>
-        <w:rPr>
-          <w:rFonts w:ascii="Times New Roman" w:hAnsi="Times New Roman" w:cs="Times New Roman"/>
-          <w:sz w:val="24"/>
-          <w:szCs w:val="24"/>
-        </w:rPr>
-        <w:t xml:space="preserve">ında </w:t>
-      </w:r>
-      <w:r>
-        <w:rPr>
-          <w:rFonts w:ascii="Times New Roman" w:hAnsi="Times New Roman" w:cs="Times New Roman"/>
-          <w:sz w:val="24"/>
-          <w:szCs w:val="24"/>
-        </w:rPr>
-        <w:t xml:space="preserve"> </w:t>
-      </w:r>
-      <w:r>
-        <w:rPr>
-          <w:rFonts w:ascii="Times New Roman" w:hAnsi="Times New Roman" w:cs="Times New Roman"/>
-          <w:sz w:val="24"/>
-          <w:szCs w:val="24"/>
-        </w:rPr>
-        <w:t>gerçekleştirdikleri</w:t>
-      </w:r>
-      <w:proofErr w:type="gramEnd"/>
-      <w:r>
-        <w:rPr>
-          <w:rFonts w:ascii="Times New Roman" w:hAnsi="Times New Roman" w:cs="Times New Roman"/>
-          <w:sz w:val="24"/>
-          <w:szCs w:val="24"/>
-        </w:rPr>
-        <w:t xml:space="preserve"> </w:t>
-      </w:r>
-      <w:r>
-        <w:rPr>
-          <w:rFonts w:ascii="Times New Roman" w:hAnsi="Times New Roman" w:cs="Times New Roman"/>
-          <w:sz w:val="24"/>
-          <w:szCs w:val="24"/>
-        </w:rPr>
-        <w:t xml:space="preserve">öğrenim kazanımlarına dayalı </w:t>
+        <w:t xml:space="preserve">, öğrencilerin teorik olarak öğrendikleri bilgileri pratiğe dökmeleri, el becerilerini geliştirmeleri ve mesleki yetkinlik kazanmaları amacıyla atölye ortamında gerçekleştirdikleri, öğrenme kazanımlarına dayalı </w:t>
       </w:r>
       <w:r>
         <w:rPr>
@@ -157,9 +66,20 @@
           <w:sz w:val="24"/>
           <w:szCs w:val="24"/>
         </w:rPr>
-        <w:t>uygulamal</w:t>
-      </w:r>
-      <w:r>
+        <w:t xml:space="preserve">uygulamalardır ve değerlendirme amacıyla yapılır.</w:t>
+      </w:r>
+      <w:r>
+        <w:rPr>
+          <w:rFonts w:ascii="Times New Roman" w:hAnsi="Times New Roman" w:cs="Times New Roman"/>
+          <w:sz w:val="24"/>
+          <w:szCs w:val="24"/>
+        </w:rPr>
+        <w:t xml:space="preserve"> Temrin, öğrencinin bir malzemeyi işleyerek, monte ederek veya somut bir ürün ya da iş ortaya koyduğu sürecin bütünüdür. Uygulamalarımızda öğrenme kazanımlarının doğru ve eksiksiz ölçülmesi önemlidir. Bu nedenle öğrencinin uygulama süreci değerlendirilmeli ve değerlendirme objektif kanıtlara dayanmalıdır.</w:t>
+      </w:r>
+    </w:p>
+    <w:p>
+      <w:pPr>
+        <w:jc w:val="both"/>
         <w:rPr>
           <w:rFonts w:ascii="Times New Roman" w:hAnsi="Times New Roman" w:cs="Times New Roman"/>
           <w:b/>
@@ -167,8 +87,7 @@
           <w:sz w:val="24"/>
           <w:szCs w:val="24"/>
         </w:rPr>
-        <w:t>ar</w:t>
-      </w:r>
+      </w:pPr>
       <w:r>
         <w:rPr>
           <w:rFonts w:ascii="Times New Roman" w:hAnsi="Times New Roman" w:cs="Times New Roman"/>
@@ -177,121 +96,23 @@
           <w:sz w:val="24"/>
           <w:szCs w:val="24"/>
         </w:rPr>
-        <w:t xml:space="preserve">ı </w:t>
-      </w:r>
-      <w:r>
-        <w:rPr>
-          <w:rFonts w:ascii="Times New Roman" w:hAnsi="Times New Roman" w:cs="Times New Roman"/>
-          <w:b/>
-          <w:bCs/>
-          <w:sz w:val="24"/>
-          <w:szCs w:val="24"/>
-        </w:rPr>
-        <w:t>değerlendirme amacı ile uygulanır.</w:t>
-      </w:r>
-      <w:r>
-        <w:rPr>
-          <w:rFonts w:ascii="Times New Roman" w:hAnsi="Times New Roman" w:cs="Times New Roman"/>
-          <w:sz w:val="24"/>
-          <w:szCs w:val="24"/>
-        </w:rPr>
-        <w:t xml:space="preserve"> Öğrencinin</w:t>
-      </w:r>
-      <w:r>
-        <w:rPr>
-          <w:rFonts w:ascii="Times New Roman" w:hAnsi="Times New Roman" w:cs="Times New Roman"/>
-          <w:sz w:val="24"/>
-          <w:szCs w:val="24"/>
-        </w:rPr>
-        <w:t xml:space="preserve">, </w:t>
-      </w:r>
-      <w:r>
-        <w:rPr>
-          <w:rFonts w:ascii="Times New Roman" w:hAnsi="Times New Roman" w:cs="Times New Roman"/>
-          <w:sz w:val="24"/>
-          <w:szCs w:val="24"/>
-        </w:rPr>
-        <w:t xml:space="preserve">bir malzemeyi işleyerek, monte </w:t>
-      </w:r>
-      <w:proofErr w:type="gramStart"/>
-      <w:r>
-        <w:rPr>
-          <w:rFonts w:ascii="Times New Roman" w:hAnsi="Times New Roman" w:cs="Times New Roman"/>
-          <w:sz w:val="24"/>
-          <w:szCs w:val="24"/>
-        </w:rPr>
-        <w:t>ederek</w:t>
-      </w:r>
-      <w:r>
-        <w:rPr>
-          <w:rFonts w:ascii="Times New Roman" w:hAnsi="Times New Roman" w:cs="Times New Roman"/>
-          <w:sz w:val="24"/>
-          <w:szCs w:val="24"/>
-        </w:rPr>
-        <w:t xml:space="preserve"> </w:t>
-      </w:r>
-      <w:r>
-        <w:rPr>
-          <w:rFonts w:ascii="Times New Roman" w:hAnsi="Times New Roman" w:cs="Times New Roman"/>
-          <w:sz w:val="24"/>
-          <w:szCs w:val="24"/>
-        </w:rPr>
-        <w:t xml:space="preserve"> veya</w:t>
-      </w:r>
-      <w:proofErr w:type="gramEnd"/>
-      <w:r>
-        <w:rPr>
-          <w:rFonts w:ascii="Times New Roman" w:hAnsi="Times New Roman" w:cs="Times New Roman"/>
-          <w:sz w:val="24"/>
-          <w:szCs w:val="24"/>
-        </w:rPr>
-        <w:t xml:space="preserve"> somut bir ürün ya da iş ortaya koyduğu sürecin bütünüdür.</w:t>
-      </w:r>
-      <w:r>
-        <w:rPr>
-          <w:rFonts w:ascii="Times New Roman" w:hAnsi="Times New Roman" w:cs="Times New Roman"/>
-          <w:sz w:val="24"/>
-          <w:szCs w:val="24"/>
-        </w:rPr>
-        <w:t xml:space="preserve"> Uygulamalarımızda öğrenim kazanımlarının doğru ve eksiksiz ölçülmesi önemlidir. Bu </w:t>
-      </w:r>
-      <w:r>
-        <w:rPr>
-          <w:rFonts w:ascii="Times New Roman" w:hAnsi="Times New Roman" w:cs="Times New Roman"/>
-          <w:sz w:val="24"/>
-          <w:szCs w:val="24"/>
-        </w:rPr>
-        <w:t>nedenle öğrencinin uygulama süreçlerinin değerlendirilmesi, objektif kanıta dayalı değerlendirme yapılması önemlidir.</w:t>
-      </w:r>
-      <w:r>
-        <w:rPr>
-          <w:rFonts w:ascii="Times New Roman" w:hAnsi="Times New Roman" w:cs="Times New Roman"/>
-          <w:sz w:val="24"/>
-          <w:szCs w:val="24"/>
-        </w:rPr>
-        <w:t xml:space="preserve"> </w:t>
+        <w:t>2. Temrin Değerlendirmesinde Dikkate Alınacak Yeterlilikler</w:t>
       </w:r>
     </w:p>
     <w:p>
       <w:pPr>
         <w:jc w:val="both"/>
         <w:rPr>
-          <w:rFonts w:ascii="Times New Roman" w:hAnsi="Times New Roman" w:cs="Times New Roman"/>
-          <w:b/>
-          <w:bCs/>
-          <w:sz w:val="24"/>
-          <w:szCs w:val="24"/>
-        </w:rPr>
-      </w:pPr>
-      <w:r>
-        <w:rPr>
-          <w:rFonts w:ascii="Times New Roman" w:hAnsi="Times New Roman" w:cs="Times New Roman"/>
-          <w:b/>
-          <w:bCs/>
-          <w:sz w:val="24"/>
-          <w:szCs w:val="24"/>
-        </w:rPr>
-        <w:t>2. Temrin Aşamaları Nelerdir?</w:t>
+          <w:sz w:val="24"/>
+          <w:szCs w:val="24"/>
+        </w:rPr>
+      </w:pPr>
+      <w:r>
+        <w:rPr>
+          <w:sz w:val="24"/>
+          <w:szCs w:val="24"/>
+        </w:rPr>
+        <w:t>Bir öğrenme kazanımının ölçülmesinde yalnızca ortaya çıkan ürünün değerlendirilmesi yeterli değildir. Öğrencinin uygulama sürecindeki bilgi, beceri ve mesleki davranışlarının bütüncül olarak değerlendirilmesi gerekmektedir.</w:t>
       </w:r>
     </w:p>
     <w:p>
@@ -307,47 +128,8 @@
           <w:sz w:val="24"/>
           <w:szCs w:val="24"/>
         </w:rPr>
-        <w:t>Bir öğrenme kazanımının ölçülmesinde yalnızca ortaya çıkan ürünün değerlendirilmesi yeterli değildir. Öğrencinin uygulama sürecindeki bilgi, beceri ve mesleki davranışlarının bütüncül olarak değerlendirilmesi gerekmektedir.</w:t>
-      </w:r>
-    </w:p>
-    <w:p>
-      <w:pPr>
-        <w:jc w:val="both"/>
-        <w:rPr>
-          <w:sz w:val="24"/>
-          <w:szCs w:val="24"/>
-        </w:rPr>
-      </w:pPr>
-      <w:r>
-        <w:rPr>
-          <w:sz w:val="24"/>
-          <w:szCs w:val="24"/>
-        </w:rPr>
-        <w:t xml:space="preserve">Temrin değerlendirmesinde, temrin konusunun ve öğrenme kazanımlarının niteliğine göre aşağıdaki yeterlilikler dikkate </w:t>
-      </w:r>
-      <w:proofErr w:type="gramStart"/>
-      <w:r>
-        <w:rPr>
-          <w:sz w:val="24"/>
-          <w:szCs w:val="24"/>
-        </w:rPr>
-        <w:t>alın</w:t>
-      </w:r>
-      <w:r>
-        <w:rPr>
-          <w:sz w:val="24"/>
-          <w:szCs w:val="24"/>
-        </w:rPr>
-        <w:t xml:space="preserve">malı </w:t>
-      </w:r>
-      <w:r>
-        <w:rPr>
-          <w:sz w:val="24"/>
-          <w:szCs w:val="24"/>
-        </w:rPr>
-        <w:t>:</w:t>
-      </w:r>
-      <w:proofErr w:type="gramEnd"/>
+        <w:t xml:space="preserve">Temrin değerlendirmesinde, temrin konusunun ve öğrenme kazanımlarının niteliğine göre aşağıdaki yeterlilikler dikkate alınmalıdır:</w:t>
+      </w:r>
     </w:p>
     <w:p>
       <w:pPr>
@@ -412,15 +194,7 @@
           <w:sz w:val="24"/>
           <w:szCs w:val="24"/>
         </w:rPr>
-        <w:t xml:space="preserve">Malzeme </w:t>
-      </w:r>
-      <w:r>
-        <w:rPr>
-          <w:rFonts w:ascii="Times New Roman" w:hAnsi="Times New Roman" w:cs="Times New Roman"/>
-          <w:sz w:val="24"/>
-          <w:szCs w:val="24"/>
-        </w:rPr>
-        <w:t>Bilgisi</w:t>
+        <w:t xml:space="preserve">Malzeme Bilgisi</w:t>
       </w:r>
     </w:p>
     <w:p>
@@ -508,7 +282,7 @@
           <w:sz w:val="24"/>
           <w:szCs w:val="24"/>
         </w:rPr>
-        <w:t xml:space="preserve">İletişim Becerileri </w:t>
+        <w:t xml:space="preserve">İletişim Becerileri</w:t>
       </w:r>
     </w:p>
     <w:p>
@@ -552,15 +326,21 @@
           <w:sz w:val="24"/>
           <w:szCs w:val="24"/>
         </w:rPr>
-        <w:t xml:space="preserve">Ekonomik Kayıp gibi yeterliliklerin de dahil edilmesi önemlidir. Öğrenim kazanımına göre değerlendirme ölçeğinde bu yeterliliklerin ağırlığı </w:t>
-      </w:r>
+        <w:t xml:space="preserve">Ekonomik Kayıp</w:t>
+      </w:r>
+    </w:p>
+    <w:p>
+      <w:pPr>
+        <w:spacing w:before="120"/>
+        <w:jc w:val="both"/>
+      </w:pPr>
       <w:r>
         <w:rPr>
           <w:rFonts w:ascii="Times New Roman" w:hAnsi="Times New Roman" w:cs="Times New Roman"/>
           <w:sz w:val="24"/>
           <w:szCs w:val="24"/>
         </w:rPr>
-        <w:t xml:space="preserve">değişebilecektir. </w:t>
+        <w:t xml:space="preserve">Bu yeterlilikler, temrinin niteliğine uygun olanlar seçilerek değerlendirmeye dahil edilmelidir. Her yeterliliğin değerlendirme ölçeğindeki ağırlığı öğrenme kazanımına göre değişebilir.</w:t>
       </w:r>
     </w:p>
     <w:p/>
@@ -587,39 +367,7 @@
           <w:iCs/>
         </w:rPr>
         <w:lastRenderedPageBreak/>
-        <w:t xml:space="preserve">Aşağıda </w:t>
-      </w:r>
-      <w:proofErr w:type="gramStart"/>
-      <w:r>
-        <w:rPr>
-          <w:i/>
-          <w:iCs/>
-        </w:rPr>
-        <w:t>Öğretmenlerimizin  Öğrenim</w:t>
-      </w:r>
-      <w:proofErr w:type="gramEnd"/>
-      <w:r>
-        <w:rPr>
-          <w:i/>
-          <w:iCs/>
-        </w:rPr>
-        <w:t xml:space="preserve"> kazanımlarına </w:t>
-      </w:r>
-      <w:proofErr w:type="gramStart"/>
-      <w:r>
-        <w:rPr>
-          <w:i/>
-          <w:iCs/>
-        </w:rPr>
-        <w:t>göre  hazırlamaları</w:t>
-      </w:r>
-      <w:proofErr w:type="gramEnd"/>
-      <w:r>
-        <w:rPr>
-          <w:i/>
-          <w:iCs/>
-        </w:rPr>
-        <w:t xml:space="preserve"> gereken temrin sayfası örneği yer almaktadır. </w:t>
+        <w:t xml:space="preserve">Aşağıda, öğretmenlerimizin öğrenme kazanımlarına göre hazırlamaları gereken temrin sayfası şablonu yer almaktadır.</w:t>
       </w:r>
     </w:p>
     <w:p>
@@ -654,17 +402,23 @@
           <w:b/>
           <w:bCs/>
         </w:rPr>
-        <w:t xml:space="preserve">Dersin </w:t>
-      </w:r>
-      <w:proofErr w:type="gramStart"/>
-      <w:r>
+        <w:t xml:space="preserve">Dersin Adı :</w:t>
+      </w:r>
+    </w:p>
+    <w:p>
+      <w:pPr>
         <w:rPr>
           <w:b/>
           <w:bCs/>
         </w:rPr>
-        <w:t>Adı :</w:t>
-      </w:r>
-      <w:proofErr w:type="gramEnd"/>
+      </w:pPr>
+      <w:r>
+        <w:rPr>
+          <w:b/>
+          <w:bCs/>
+        </w:rPr>
+        <w:t xml:space="preserve">Temrin No :</w:t>
+      </w:r>
     </w:p>
     <w:p>
       <w:pPr>
@@ -678,17 +432,16 @@
           <w:b/>
           <w:bCs/>
         </w:rPr>
-        <w:t xml:space="preserve">Temrin </w:t>
-      </w:r>
-      <w:proofErr w:type="gramStart"/>
-      <w:r>
+        <w:t xml:space="preserve">İşlem Konusu :</w:t>
+      </w:r>
+    </w:p>
+    <w:p>
+      <w:pPr>
         <w:rPr>
           <w:b/>
           <w:bCs/>
         </w:rPr>
-        <w:t>No :</w:t>
-      </w:r>
-      <w:proofErr w:type="gramEnd"/>
+      </w:pPr>
     </w:p>
     <w:p>
       <w:pPr>
@@ -702,17 +455,16 @@
           <w:b/>
           <w:bCs/>
         </w:rPr>
-        <w:t xml:space="preserve">İşlem </w:t>
-      </w:r>
-      <w:proofErr w:type="gramStart"/>
-      <w:r>
+        <w:t xml:space="preserve">Öğrenme Kazanımı :</w:t>
+      </w:r>
+    </w:p>
+    <w:p>
+      <w:pPr>
         <w:rPr>
           <w:b/>
           <w:bCs/>
         </w:rPr>
-        <w:t>Konusu :</w:t>
-      </w:r>
-      <w:proofErr w:type="gramEnd"/>
+      </w:pPr>
     </w:p>
     <w:p>
       <w:pPr>
@@ -721,6 +473,13 @@
           <w:bCs/>
         </w:rPr>
       </w:pPr>
+      <w:r>
+        <w:rPr>
+          <w:b/>
+          <w:bCs/>
+        </w:rPr>
+        <w:t xml:space="preserve">Kullanılan Araç / Gereç / Donanım / Yazılım / Materyal :</w:t>
+      </w:r>
     </w:p>
     <w:p>
       <w:pPr>
@@ -729,54 +488,21 @@
           <w:bCs/>
         </w:rPr>
       </w:pPr>
-      <w:r>
+    </w:p>
+    <w:p>
+      <w:pPr>
         <w:rPr>
           <w:b/>
           <w:bCs/>
         </w:rPr>
-        <w:t xml:space="preserve">Kullanılan Araç / gereç / donanım /yazılım / </w:t>
-      </w:r>
-      <w:proofErr w:type="gramStart"/>
+      </w:pPr>
       <w:r>
         <w:rPr>
           <w:b/>
           <w:bCs/>
         </w:rPr>
-        <w:t>materyal :</w:t>
-      </w:r>
-      <w:proofErr w:type="gramEnd"/>
-    </w:p>
-    <w:p>
-      <w:pPr>
-        <w:rPr>
-          <w:b/>
-          <w:bCs/>
-        </w:rPr>
-      </w:pPr>
-    </w:p>
-    <w:p>
-      <w:pPr>
-        <w:rPr>
-          <w:b/>
-          <w:bCs/>
-        </w:rPr>
-      </w:pPr>
-      <w:r>
-        <w:rPr>
-          <w:b/>
-          <w:bCs/>
-        </w:rPr>
-        <w:t xml:space="preserve">Yapılacak </w:t>
-      </w:r>
-      <w:proofErr w:type="gramStart"/>
-      <w:r>
-        <w:rPr>
-          <w:b/>
-          <w:bCs/>
-        </w:rPr>
-        <w:t>İşlemler :</w:t>
-      </w:r>
-      <w:proofErr w:type="gramEnd"/>
+        <w:t xml:space="preserve">Yapılacak İşlemler :</w:t>
+      </w:r>
     </w:p>
     <w:p/>
     <w:p>
@@ -794,62 +520,8 @@
           <w:iCs/>
           <w:u w:val="single"/>
         </w:rPr>
-        <w:t xml:space="preserve">Temrin </w:t>
-      </w:r>
-      <w:proofErr w:type="gramStart"/>
-      <w:r>
-        <w:rPr>
-          <w:i/>
-          <w:iCs/>
-          <w:u w:val="single"/>
-        </w:rPr>
-        <w:t>Değerlendirmesi :</w:t>
-      </w:r>
-      <w:proofErr w:type="gramEnd"/>
-      <w:r>
-        <w:rPr>
-          <w:i/>
-          <w:iCs/>
-          <w:u w:val="single"/>
-        </w:rPr>
-        <w:t xml:space="preserve"> </w:t>
-      </w:r>
-      <w:proofErr w:type="gramStart"/>
-      <w:r>
-        <w:rPr>
-          <w:i/>
-          <w:iCs/>
-          <w:u w:val="single"/>
-        </w:rPr>
-        <w:t>( Tablonun</w:t>
-      </w:r>
-      <w:proofErr w:type="gramEnd"/>
-      <w:r>
-        <w:rPr>
-          <w:i/>
-          <w:iCs/>
-          <w:u w:val="single"/>
-        </w:rPr>
-        <w:t xml:space="preserve"> </w:t>
-      </w:r>
-      <w:r>
-        <w:rPr>
-          <w:i/>
-          <w:iCs/>
-          <w:u w:val="single"/>
-        </w:rPr>
-        <w:t>öğrenim kazanımına göre öğretmen tarafından doldurulması gerekmektedir</w:t>
-      </w:r>
-      <w:proofErr w:type="gramStart"/>
-      <w:r>
-        <w:rPr>
-          <w:i/>
-          <w:iCs/>
-          <w:u w:val="single"/>
-        </w:rPr>
-        <w:t>. )</w:t>
-      </w:r>
-      <w:proofErr w:type="gramEnd"/>
+        <w:t xml:space="preserve">Temrin Değerlendirmesi : (Tablo, öğrenme kazanımına göre öğretmen tarafından doldurulmalıdır.)</w:t>
+      </w:r>
     </w:p>
     <w:tbl>
       <w:tblPr>
@@ -859,15 +531,15 @@
         <w:tblLook w:val="04A0" w:firstRow="1" w:lastRow="0" w:firstColumn="1" w:lastColumn="0" w:noHBand="0" w:noVBand="1"/>
       </w:tblPr>
       <w:tblGrid>
-        <w:gridCol w:w="5805"/>
-        <w:gridCol w:w="1142"/>
-        <w:gridCol w:w="1070"/>
-        <w:gridCol w:w="1045"/>
+        <w:gridCol w:w="4900"/>
+        <w:gridCol w:w="1000"/>
+        <w:gridCol w:w="900"/>
+        <w:gridCol w:w="2262"/>
       </w:tblGrid>
       <w:tr>
         <w:tc>
           <w:tcPr>
-            <w:tcW w:w="5805" w:type="dxa"/>
+            <w:tcW w:w="4900" w:type="dxa"/>
             <w:vAlign w:val="center"/>
           </w:tcPr>
           <w:p>
@@ -881,7 +553,7 @@
         </w:tc>
         <w:tc>
           <w:tcPr>
-            <w:tcW w:w="1142" w:type="dxa"/>
+            <w:tcW w:w="1000" w:type="dxa"/>
           </w:tcPr>
           <w:p>
             <w:r>
@@ -891,7 +563,7 @@
         </w:tc>
         <w:tc>
           <w:tcPr>
-            <w:tcW w:w="1070" w:type="dxa"/>
+            <w:tcW w:w="900" w:type="dxa"/>
           </w:tcPr>
           <w:p>
             <w:r>
@@ -901,7 +573,7 @@
         </w:tc>
         <w:tc>
           <w:tcPr>
-            <w:tcW w:w="1045" w:type="dxa"/>
+            <w:tcW w:w="2262" w:type="dxa"/>
           </w:tcPr>
           <w:p>
             <w:r>
@@ -913,7 +585,7 @@
       <w:tr>
         <w:tc>
           <w:tcPr>
-            <w:tcW w:w="5805" w:type="dxa"/>
+            <w:tcW w:w="4900" w:type="dxa"/>
           </w:tcPr>
           <w:p>
             <w:pPr>
@@ -933,7 +605,7 @@
         </w:tc>
         <w:tc>
           <w:tcPr>
-            <w:tcW w:w="1142" w:type="dxa"/>
+            <w:tcW w:w="1000" w:type="dxa"/>
           </w:tcPr>
           <w:p>
             <w:pPr>
@@ -943,13 +615,13 @@
         </w:tc>
         <w:tc>
           <w:tcPr>
-            <w:tcW w:w="1070" w:type="dxa"/>
-          </w:tcPr>
-          <w:p/>
-        </w:tc>
-        <w:tc>
-          <w:tcPr>
-            <w:tcW w:w="1045" w:type="dxa"/>
+            <w:tcW w:w="900" w:type="dxa"/>
+          </w:tcPr>
+          <w:p/>
+        </w:tc>
+        <w:tc>
+          <w:tcPr>
+            <w:tcW w:w="2262" w:type="dxa"/>
           </w:tcPr>
           <w:p/>
         </w:tc>
@@ -957,7 +629,7 @@
       <w:tr>
         <w:tc>
           <w:tcPr>
-            <w:tcW w:w="5805" w:type="dxa"/>
+            <w:tcW w:w="4900" w:type="dxa"/>
           </w:tcPr>
           <w:p>
             <w:pPr>
@@ -977,7 +649,7 @@
         </w:tc>
         <w:tc>
           <w:tcPr>
-            <w:tcW w:w="1142" w:type="dxa"/>
+            <w:tcW w:w="1000" w:type="dxa"/>
           </w:tcPr>
           <w:p>
             <w:pPr>
@@ -987,13 +659,13 @@
         </w:tc>
         <w:tc>
           <w:tcPr>
-            <w:tcW w:w="1070" w:type="dxa"/>
-          </w:tcPr>
-          <w:p/>
-        </w:tc>
-        <w:tc>
-          <w:tcPr>
-            <w:tcW w:w="1045" w:type="dxa"/>
+            <w:tcW w:w="900" w:type="dxa"/>
+          </w:tcPr>
+          <w:p/>
+        </w:tc>
+        <w:tc>
+          <w:tcPr>
+            <w:tcW w:w="2262" w:type="dxa"/>
           </w:tcPr>
           <w:p/>
         </w:tc>
@@ -1001,7 +673,7 @@
       <w:tr>
         <w:tc>
           <w:tcPr>
-            <w:tcW w:w="5805" w:type="dxa"/>
+            <w:tcW w:w="4900" w:type="dxa"/>
           </w:tcPr>
           <w:p>
             <w:pPr>
@@ -1021,7 +693,7 @@
         </w:tc>
         <w:tc>
           <w:tcPr>
-            <w:tcW w:w="1142" w:type="dxa"/>
+            <w:tcW w:w="1000" w:type="dxa"/>
             <w:vAlign w:val="center"/>
           </w:tcPr>
           <w:p>
@@ -1032,13 +704,13 @@
         </w:tc>
         <w:tc>
           <w:tcPr>
-            <w:tcW w:w="1070" w:type="dxa"/>
-          </w:tcPr>
-          <w:p/>
-        </w:tc>
-        <w:tc>
-          <w:tcPr>
-            <w:tcW w:w="1045" w:type="dxa"/>
+            <w:tcW w:w="900" w:type="dxa"/>
+          </w:tcPr>
+          <w:p/>
+        </w:tc>
+        <w:tc>
+          <w:tcPr>
+            <w:tcW w:w="2262" w:type="dxa"/>
           </w:tcPr>
           <w:p/>
         </w:tc>
@@ -1046,13 +718,13 @@
       <w:tr>
         <w:tc>
           <w:tcPr>
-            <w:tcW w:w="5805" w:type="dxa"/>
-          </w:tcPr>
-          <w:p/>
-        </w:tc>
-        <w:tc>
-          <w:tcPr>
-            <w:tcW w:w="1142" w:type="dxa"/>
+            <w:tcW w:w="4900" w:type="dxa"/>
+          </w:tcPr>
+          <w:p/>
+        </w:tc>
+        <w:tc>
+          <w:tcPr>
+            <w:tcW w:w="1000" w:type="dxa"/>
             <w:vAlign w:val="center"/>
           </w:tcPr>
           <w:p>
@@ -1063,13 +735,13 @@
         </w:tc>
         <w:tc>
           <w:tcPr>
-            <w:tcW w:w="1070" w:type="dxa"/>
-          </w:tcPr>
-          <w:p/>
-        </w:tc>
-        <w:tc>
-          <w:tcPr>
-            <w:tcW w:w="1045" w:type="dxa"/>
+            <w:tcW w:w="900" w:type="dxa"/>
+          </w:tcPr>
+          <w:p/>
+        </w:tc>
+        <w:tc>
+          <w:tcPr>
+            <w:tcW w:w="2262" w:type="dxa"/>
           </w:tcPr>
           <w:p/>
         </w:tc>
@@ -1077,13 +749,13 @@
       <w:tr>
         <w:tc>
           <w:tcPr>
-            <w:tcW w:w="5805" w:type="dxa"/>
-          </w:tcPr>
-          <w:p/>
-        </w:tc>
-        <w:tc>
-          <w:tcPr>
-            <w:tcW w:w="1142" w:type="dxa"/>
+            <w:tcW w:w="4900" w:type="dxa"/>
+          </w:tcPr>
+          <w:p/>
+        </w:tc>
+        <w:tc>
+          <w:tcPr>
+            <w:tcW w:w="1000" w:type="dxa"/>
             <w:vAlign w:val="center"/>
           </w:tcPr>
           <w:p>
@@ -1094,13 +766,13 @@
         </w:tc>
         <w:tc>
           <w:tcPr>
-            <w:tcW w:w="1070" w:type="dxa"/>
-          </w:tcPr>
-          <w:p/>
-        </w:tc>
-        <w:tc>
-          <w:tcPr>
-            <w:tcW w:w="1045" w:type="dxa"/>
+            <w:tcW w:w="900" w:type="dxa"/>
+          </w:tcPr>
+          <w:p/>
+        </w:tc>
+        <w:tc>
+          <w:tcPr>
+            <w:tcW w:w="2262" w:type="dxa"/>
           </w:tcPr>
           <w:p/>
         </w:tc>
@@ -1108,13 +780,13 @@
       <w:tr>
         <w:tc>
           <w:tcPr>
-            <w:tcW w:w="5805" w:type="dxa"/>
-          </w:tcPr>
-          <w:p/>
-        </w:tc>
-        <w:tc>
-          <w:tcPr>
-            <w:tcW w:w="1142" w:type="dxa"/>
+            <w:tcW w:w="4900" w:type="dxa"/>
+          </w:tcPr>
+          <w:p/>
+        </w:tc>
+        <w:tc>
+          <w:tcPr>
+            <w:tcW w:w="1000" w:type="dxa"/>
             <w:vAlign w:val="center"/>
           </w:tcPr>
           <w:p>
@@ -1125,13 +797,13 @@
         </w:tc>
         <w:tc>
           <w:tcPr>
-            <w:tcW w:w="1070" w:type="dxa"/>
-          </w:tcPr>
-          <w:p/>
-        </w:tc>
-        <w:tc>
-          <w:tcPr>
-            <w:tcW w:w="1045" w:type="dxa"/>
+            <w:tcW w:w="900" w:type="dxa"/>
+          </w:tcPr>
+          <w:p/>
+        </w:tc>
+        <w:tc>
+          <w:tcPr>
+            <w:tcW w:w="2262" w:type="dxa"/>
           </w:tcPr>
           <w:p/>
         </w:tc>
@@ -1139,13 +811,13 @@
       <w:tr>
         <w:tc>
           <w:tcPr>
-            <w:tcW w:w="5805" w:type="dxa"/>
-          </w:tcPr>
-          <w:p/>
-        </w:tc>
-        <w:tc>
-          <w:tcPr>
-            <w:tcW w:w="1142" w:type="dxa"/>
+            <w:tcW w:w="4900" w:type="dxa"/>
+          </w:tcPr>
+          <w:p/>
+        </w:tc>
+        <w:tc>
+          <w:tcPr>
+            <w:tcW w:w="1000" w:type="dxa"/>
             <w:vAlign w:val="center"/>
           </w:tcPr>
           <w:p>
@@ -1156,13 +828,13 @@
         </w:tc>
         <w:tc>
           <w:tcPr>
-            <w:tcW w:w="1070" w:type="dxa"/>
-          </w:tcPr>
-          <w:p/>
-        </w:tc>
-        <w:tc>
-          <w:tcPr>
-            <w:tcW w:w="1045" w:type="dxa"/>
+            <w:tcW w:w="900" w:type="dxa"/>
+          </w:tcPr>
+          <w:p/>
+        </w:tc>
+        <w:tc>
+          <w:tcPr>
+            <w:tcW w:w="2262" w:type="dxa"/>
           </w:tcPr>
           <w:p/>
         </w:tc>
@@ -1170,13 +842,13 @@
       <w:tr>
         <w:tc>
           <w:tcPr>
-            <w:tcW w:w="5805" w:type="dxa"/>
-          </w:tcPr>
-          <w:p/>
-        </w:tc>
-        <w:tc>
-          <w:tcPr>
-            <w:tcW w:w="1142" w:type="dxa"/>
+            <w:tcW w:w="4900" w:type="dxa"/>
+          </w:tcPr>
+          <w:p/>
+        </w:tc>
+        <w:tc>
+          <w:tcPr>
+            <w:tcW w:w="1000" w:type="dxa"/>
             <w:vAlign w:val="center"/>
           </w:tcPr>
           <w:p>
@@ -1187,13 +859,13 @@
         </w:tc>
         <w:tc>
           <w:tcPr>
-            <w:tcW w:w="1070" w:type="dxa"/>
-          </w:tcPr>
-          <w:p/>
-        </w:tc>
-        <w:tc>
-          <w:tcPr>
-            <w:tcW w:w="1045" w:type="dxa"/>
+            <w:tcW w:w="900" w:type="dxa"/>
+          </w:tcPr>
+          <w:p/>
+        </w:tc>
+        <w:tc>
+          <w:tcPr>
+            <w:tcW w:w="2262" w:type="dxa"/>
           </w:tcPr>
           <w:p/>
         </w:tc>
@@ -1201,13 +873,13 @@
       <w:tr>
         <w:tc>
           <w:tcPr>
-            <w:tcW w:w="5805" w:type="dxa"/>
-          </w:tcPr>
-          <w:p/>
-        </w:tc>
-        <w:tc>
-          <w:tcPr>
-            <w:tcW w:w="1142" w:type="dxa"/>
+            <w:tcW w:w="4900" w:type="dxa"/>
+          </w:tcPr>
+          <w:p/>
+        </w:tc>
+        <w:tc>
+          <w:tcPr>
+            <w:tcW w:w="1000" w:type="dxa"/>
             <w:vAlign w:val="center"/>
           </w:tcPr>
           <w:p>
@@ -1218,13 +890,13 @@
         </w:tc>
         <w:tc>
           <w:tcPr>
-            <w:tcW w:w="1070" w:type="dxa"/>
-          </w:tcPr>
-          <w:p/>
-        </w:tc>
-        <w:tc>
-          <w:tcPr>
-            <w:tcW w:w="1045" w:type="dxa"/>
+            <w:tcW w:w="900" w:type="dxa"/>
+          </w:tcPr>
+          <w:p/>
+        </w:tc>
+        <w:tc>
+          <w:tcPr>
+            <w:tcW w:w="2262" w:type="dxa"/>
           </w:tcPr>
           <w:p/>
         </w:tc>
@@ -1232,13 +904,13 @@
       <w:tr>
         <w:tc>
           <w:tcPr>
-            <w:tcW w:w="5805" w:type="dxa"/>
-          </w:tcPr>
-          <w:p/>
-        </w:tc>
-        <w:tc>
-          <w:tcPr>
-            <w:tcW w:w="1142" w:type="dxa"/>
+            <w:tcW w:w="4900" w:type="dxa"/>
+          </w:tcPr>
+          <w:p/>
+        </w:tc>
+        <w:tc>
+          <w:tcPr>
+            <w:tcW w:w="1000" w:type="dxa"/>
             <w:vAlign w:val="center"/>
           </w:tcPr>
           <w:p>
@@ -1249,13 +921,13 @@
         </w:tc>
         <w:tc>
           <w:tcPr>
-            <w:tcW w:w="1070" w:type="dxa"/>
-          </w:tcPr>
-          <w:p/>
-        </w:tc>
-        <w:tc>
-          <w:tcPr>
-            <w:tcW w:w="1045" w:type="dxa"/>
+            <w:tcW w:w="900" w:type="dxa"/>
+          </w:tcPr>
+          <w:p/>
+        </w:tc>
+        <w:tc>
+          <w:tcPr>
+            <w:tcW w:w="2262" w:type="dxa"/>
           </w:tcPr>
           <w:p/>
         </w:tc>
@@ -1263,13 +935,13 @@
       <w:tr>
         <w:tc>
           <w:tcPr>
-            <w:tcW w:w="5805" w:type="dxa"/>
-          </w:tcPr>
-          <w:p/>
-        </w:tc>
-        <w:tc>
-          <w:tcPr>
-            <w:tcW w:w="1142" w:type="dxa"/>
+            <w:tcW w:w="4900" w:type="dxa"/>
+          </w:tcPr>
+          <w:p/>
+        </w:tc>
+        <w:tc>
+          <w:tcPr>
+            <w:tcW w:w="1000" w:type="dxa"/>
             <w:vAlign w:val="center"/>
           </w:tcPr>
           <w:p>
@@ -1280,13 +952,13 @@
         </w:tc>
         <w:tc>
           <w:tcPr>
-            <w:tcW w:w="1070" w:type="dxa"/>
-          </w:tcPr>
-          <w:p/>
-        </w:tc>
-        <w:tc>
-          <w:tcPr>
-            <w:tcW w:w="1045" w:type="dxa"/>
+            <w:tcW w:w="900" w:type="dxa"/>
+          </w:tcPr>
+          <w:p/>
+        </w:tc>
+        <w:tc>
+          <w:tcPr>
+            <w:tcW w:w="2262" w:type="dxa"/>
           </w:tcPr>
           <w:p/>
         </w:tc>
@@ -1294,13 +966,13 @@
       <w:tr>
         <w:tc>
           <w:tcPr>
-            <w:tcW w:w="5805" w:type="dxa"/>
-          </w:tcPr>
-          <w:p/>
-        </w:tc>
-        <w:tc>
-          <w:tcPr>
-            <w:tcW w:w="1142" w:type="dxa"/>
+            <w:tcW w:w="4900" w:type="dxa"/>
+          </w:tcPr>
+          <w:p/>
+        </w:tc>
+        <w:tc>
+          <w:tcPr>
+            <w:tcW w:w="1000" w:type="dxa"/>
             <w:vAlign w:val="center"/>
           </w:tcPr>
           <w:p>
@@ -1311,13 +983,13 @@
         </w:tc>
         <w:tc>
           <w:tcPr>
-            <w:tcW w:w="1070" w:type="dxa"/>
-          </w:tcPr>
-          <w:p/>
-        </w:tc>
-        <w:tc>
-          <w:tcPr>
-            <w:tcW w:w="1045" w:type="dxa"/>
+            <w:tcW w:w="900" w:type="dxa"/>
+          </w:tcPr>
+          <w:p/>
+        </w:tc>
+        <w:tc>
+          <w:tcPr>
+            <w:tcW w:w="2262" w:type="dxa"/>
           </w:tcPr>
           <w:p/>
         </w:tc>
@@ -1325,13 +997,13 @@
       <w:tr>
         <w:tc>
           <w:tcPr>
-            <w:tcW w:w="5805" w:type="dxa"/>
-          </w:tcPr>
-          <w:p/>
-        </w:tc>
-        <w:tc>
-          <w:tcPr>
-            <w:tcW w:w="1142" w:type="dxa"/>
+            <w:tcW w:w="4900" w:type="dxa"/>
+          </w:tcPr>
+          <w:p/>
+        </w:tc>
+        <w:tc>
+          <w:tcPr>
+            <w:tcW w:w="1000" w:type="dxa"/>
             <w:vAlign w:val="center"/>
           </w:tcPr>
           <w:p>
@@ -1342,13 +1014,13 @@
         </w:tc>
         <w:tc>
           <w:tcPr>
-            <w:tcW w:w="1070" w:type="dxa"/>
-          </w:tcPr>
-          <w:p/>
-        </w:tc>
-        <w:tc>
-          <w:tcPr>
-            <w:tcW w:w="1045" w:type="dxa"/>
+            <w:tcW w:w="900" w:type="dxa"/>
+          </w:tcPr>
+          <w:p/>
+        </w:tc>
+        <w:tc>
+          <w:tcPr>
+            <w:tcW w:w="2262" w:type="dxa"/>
           </w:tcPr>
           <w:p/>
         </w:tc>
@@ -1356,13 +1028,13 @@
       <w:tr>
         <w:tc>
           <w:tcPr>
-            <w:tcW w:w="5805" w:type="dxa"/>
-          </w:tcPr>
-          <w:p/>
-        </w:tc>
-        <w:tc>
-          <w:tcPr>
-            <w:tcW w:w="1142" w:type="dxa"/>
+            <w:tcW w:w="4900" w:type="dxa"/>
+          </w:tcPr>
+          <w:p/>
+        </w:tc>
+        <w:tc>
+          <w:tcPr>
+            <w:tcW w:w="1000" w:type="dxa"/>
             <w:vAlign w:val="center"/>
           </w:tcPr>
           <w:p>
@@ -1373,13 +1045,13 @@
         </w:tc>
         <w:tc>
           <w:tcPr>
-            <w:tcW w:w="1070" w:type="dxa"/>
-          </w:tcPr>
-          <w:p/>
-        </w:tc>
-        <w:tc>
-          <w:tcPr>
-            <w:tcW w:w="1045" w:type="dxa"/>
+            <w:tcW w:w="900" w:type="dxa"/>
+          </w:tcPr>
+          <w:p/>
+        </w:tc>
+        <w:tc>
+          <w:tcPr>
+            <w:tcW w:w="2262" w:type="dxa"/>
           </w:tcPr>
           <w:p/>
         </w:tc>
@@ -1387,7 +1059,7 @@
       <w:tr>
         <w:tc>
           <w:tcPr>
-            <w:tcW w:w="5805" w:type="dxa"/>
+            <w:tcW w:w="4900" w:type="dxa"/>
           </w:tcPr>
           <w:p>
             <w:pPr>
@@ -1400,7 +1072,7 @@
         </w:tc>
         <w:tc>
           <w:tcPr>
-            <w:tcW w:w="1142" w:type="dxa"/>
+            <w:tcW w:w="1000" w:type="dxa"/>
           </w:tcPr>
           <w:p>
             <w:pPr>
@@ -1413,13 +1085,13 @@
         </w:tc>
         <w:tc>
           <w:tcPr>
-            <w:tcW w:w="1070" w:type="dxa"/>
-          </w:tcPr>
-          <w:p/>
-        </w:tc>
-        <w:tc>
-          <w:tcPr>
-            <w:tcW w:w="1045" w:type="dxa"/>
+            <w:tcW w:w="900" w:type="dxa"/>
+          </w:tcPr>
+          <w:p/>
+        </w:tc>
+        <w:tc>
+          <w:tcPr>
+            <w:tcW w:w="2262" w:type="dxa"/>
           </w:tcPr>
           <w:p/>
         </w:tc>
@@ -1427,6 +1099,56 @@
     </w:tbl>
     <w:p>
       <w:pPr>
+        <w:spacing w:after="0"/>
+      </w:pPr>
+    </w:p>
+    <w:p>
+      <w:pPr>
+        <w:tabs>
+          <w:tab w:val="left" w:pos="5103"/>
+        </w:tabs>
+        <w:spacing w:after="0" w:line="360" w:lineRule="auto"/>
+      </w:pPr>
+      <w:r>
+        <w:t xml:space="preserve">Öğrenci No :</w:t>
+        <w:tab/>
+        <w:t xml:space="preserve">Öğretmenin Adı Soyadı :</w:t>
+      </w:r>
+    </w:p>
+    <w:p>
+      <w:pPr>
+        <w:tabs>
+          <w:tab w:val="left" w:pos="5103"/>
+        </w:tabs>
+        <w:spacing w:after="0" w:line="360" w:lineRule="auto"/>
+      </w:pPr>
+      <w:r>
+        <w:t xml:space="preserve">Öğrenci Adı Soyadı :</w:t>
+        <w:tab/>
+        <w:t xml:space="preserve">Öğretmenin İmzası :</w:t>
+      </w:r>
+    </w:p>
+    <w:p>
+      <w:pPr>
+        <w:tabs>
+          <w:tab w:val="left" w:pos="5103"/>
+        </w:tabs>
+        <w:spacing w:after="0" w:line="360" w:lineRule="auto"/>
+      </w:pPr>
+      <w:r>
+        <w:t xml:space="preserve">Öğrenci Sınıfı / Şubesi :</w:t>
+        <w:tab/>
+        <w:t xml:space="preserve">Tarih :</w:t>
+      </w:r>
+    </w:p>
+    <w:p>
+      <w:pPr>
+        <w:spacing w:after="0"/>
+      </w:pPr>
+    </w:p>
+    <w:p>
+      <w:pPr>
+        <w:keepNext/>
         <w:spacing w:after="0"/>
         <w:rPr>
           <w:b/>
@@ -1453,21 +1175,7 @@
         <w:spacing w:after="0" w:line="278" w:lineRule="auto"/>
       </w:pPr>
       <w:r>
-        <w:t xml:space="preserve">Temrinde işlem konusu, kullanılan </w:t>
-      </w:r>
-      <w:r>
-        <w:t>a</w:t>
-      </w:r>
-      <w:r>
-        <w:t>raç/gereç/donanım/yazılım/</w:t>
-      </w:r>
-      <w:proofErr w:type="gramStart"/>
-      <w:r>
-        <w:t>materyal,  yapılacak</w:t>
-      </w:r>
-      <w:proofErr w:type="gramEnd"/>
-      <w:r>
-        <w:t xml:space="preserve"> işlemler ve değerlendirilecek </w:t>
+        <w:t xml:space="preserve">Temrinde işlem konusu, kullanılan araç/gereç/donanım/yazılım/materyal,  yapılacak işlemler ve değerlendirilecek </w:t>
       </w:r>
       <w:r>
         <w:rPr>
@@ -1479,13 +1187,7 @@
         <w:t>kazanımlar</w:t>
       </w:r>
       <w:r>
-        <w:t xml:space="preserve"> konuya uygun olarak her temrin için öğretmen tarafından oluşturul</w:t>
-      </w:r>
-      <w:r>
-        <w:t>ur</w:t>
-      </w:r>
-      <w:r>
-        <w:t>.</w:t>
+        <w:t xml:space="preserve"> konuya uygun olarak her temrin için öğretmen tarafından oluşturulur.</w:t>
       </w:r>
     </w:p>
     <w:p>
@@ -1533,7 +1235,7 @@
         <w:spacing w:after="0" w:line="278" w:lineRule="auto"/>
       </w:pPr>
       <w:r>
-        <w:t xml:space="preserve">Temrin sırasındaki tespitler ve temrin sonucunda oluşturulan genel değerlendirme </w:t>
+        <w:t xml:space="preserve">Tablodaki ilk üç satır her temrinde yer alır. Diğer satırlar, 2. bölümdeki yeterliliklerden ve temrinin öğrenme kazanımlarından seçilerek öğretmen tarafından eklenir; </w:t>
       </w:r>
       <w:r>
         <w:rPr>
@@ -1542,13 +1244,10 @@
           <w:i/>
           <w:iCs/>
         </w:rPr>
-        <w:t>kanıtları</w:t>
-      </w:r>
-      <w:r>
-        <w:t xml:space="preserve"> değerlendirme dosyasına ilave edilmelidir.</w:t>
-      </w:r>
-      <w:r>
-        <w:br/>
+        <w:t>kazanım puanlarının toplamı 100</w:t>
+      </w:r>
+      <w:r>
+        <w:t xml:space="preserve"> olmalıdır.</w:t>
       </w:r>
     </w:p>
     <w:p>
@@ -1558,11 +1257,43 @@
     </w:p>
     <w:p>
       <w:pPr>
+        <w:pStyle w:val="ListeParagraf"/>
+        <w:numPr>
+          <w:ilvl w:val="0"/>
+          <w:numId w:val="12"/>
+        </w:numPr>
         <w:spacing w:after="0" w:line="278" w:lineRule="auto"/>
       </w:pPr>
+      <w:r>
+        <w:t xml:space="preserve">Temrin sırasındaki tespitler ve temrin sonucunda oluşturulan genel değerlendirme </w:t>
+      </w:r>
+      <w:r>
+        <w:rPr>
+          <w:b/>
+          <w:bCs/>
+          <w:i/>
+          <w:iCs/>
+        </w:rPr>
+        <w:t>kanıtları</w:t>
+      </w:r>
+      <w:r>
+        <w:t xml:space="preserve"> değerlendirme dosyasına ilave edilmelidir.</w:t>
+        <w:br/>
+      </w:r>
     </w:p>
     <w:p>
       <w:pPr>
+        <w:pStyle w:val="ListeParagraf"/>
+      </w:pPr>
+    </w:p>
+    <w:p>
+      <w:pPr>
+        <w:spacing w:after="0" w:line="278" w:lineRule="auto"/>
+      </w:pPr>
+    </w:p>
+    <w:p>
+      <w:pPr>
+        <w:pageBreakBefore/>
         <w:jc w:val="center"/>
         <w:rPr>
           <w:b/>
@@ -1571,7 +1302,6 @@
           <w:szCs w:val="28"/>
         </w:rPr>
       </w:pPr>
-      <w:proofErr w:type="gramStart"/>
       <w:r>
         <w:rPr>
           <w:b/>
@@ -1579,56 +1309,46 @@
           <w:sz w:val="28"/>
           <w:szCs w:val="28"/>
         </w:rPr>
-        <w:t>20….</w:t>
-      </w:r>
-      <w:proofErr w:type="gramEnd"/>
-      <w:r>
+        <w:t>20….. – 20…. ÖĞRETİM YILI</w:t>
+      </w:r>
+    </w:p>
+    <w:p>
+      <w:pPr>
+        <w:jc w:val="center"/>
         <w:rPr>
           <w:b/>
           <w:bCs/>
           <w:sz w:val="28"/>
           <w:szCs w:val="28"/>
         </w:rPr>
-        <w:t>. – 20…. ÖĞRETİM YILI</w:t>
-      </w:r>
-    </w:p>
-    <w:p>
-      <w:pPr>
-        <w:jc w:val="center"/>
+      </w:pPr>
+      <w:r>
         <w:rPr>
           <w:b/>
           <w:bCs/>
           <w:sz w:val="28"/>
           <w:szCs w:val="28"/>
         </w:rPr>
-      </w:pPr>
-      <w:r>
+        <w:t>……………………………………………………. ALANI / DALI</w:t>
+      </w:r>
+    </w:p>
+    <w:p>
+      <w:pPr>
+        <w:jc w:val="center"/>
         <w:rPr>
           <w:b/>
           <w:bCs/>
           <w:sz w:val="28"/>
           <w:szCs w:val="28"/>
         </w:rPr>
-        <w:t>……………………………………………………. ALANI / DALI</w:t>
-      </w:r>
-    </w:p>
-    <w:p>
-      <w:pPr>
-        <w:jc w:val="center"/>
+      </w:pPr>
+      <w:r>
         <w:rPr>
           <w:b/>
           <w:bCs/>
           <w:sz w:val="28"/>
           <w:szCs w:val="28"/>
         </w:rPr>
-      </w:pPr>
-      <w:r>
-        <w:rPr>
-          <w:b/>
-          <w:bCs/>
-          <w:sz w:val="28"/>
-          <w:szCs w:val="28"/>
-        </w:rPr>
         <w:t>MODÜL NOT FİŞİ</w:t>
       </w:r>
     </w:p>
@@ -1645,23 +1365,7 @@
           <w:i/>
           <w:iCs/>
         </w:rPr>
-        <w:t xml:space="preserve">Not; (Katsayılar %70 uygulama sınavına %40 </w:t>
-      </w:r>
-      <w:proofErr w:type="spellStart"/>
-      <w:r>
-        <w:rPr>
-          <w:i/>
-          <w:iCs/>
-        </w:rPr>
-        <w:t>lık</w:t>
-      </w:r>
-      <w:proofErr w:type="spellEnd"/>
-      <w:r>
-        <w:rPr>
-          <w:i/>
-          <w:iCs/>
-        </w:rPr>
-        <w:t xml:space="preserve"> temrin uygulamasını ilave edilmesi ile bulunmuştur.)</w:t>
+        <w:t xml:space="preserve">Not; (Katsayılar %70 uygulama sınavına %40 lık temrin uygulamasını ilave edilmesi ile bulunmuştur.)</w:t>
       </w:r>
     </w:p>
     <w:tbl>
@@ -2053,20 +1757,8 @@
                 <w:szCs w:val="18"/>
               </w:rPr>
               <w:t>%42</w:t>
-            </w:r>
-            <w:r>
-              <w:rPr>
-                <w:sz w:val="18"/>
-                <w:szCs w:val="18"/>
-              </w:rPr>
               <w:br/>
               <w:t>Pratik</w:t>
-            </w:r>
-            <w:r>
-              <w:rPr>
-                <w:sz w:val="18"/>
-                <w:szCs w:val="18"/>
-              </w:rPr>
               <w:br/>
               <w:t>(Uygulama Düzeyi)</w:t>
             </w:r>
@@ -2106,12 +1798,6 @@
                 <w:szCs w:val="18"/>
               </w:rPr>
               <w:t>Temrin</w:t>
-            </w:r>
-            <w:r>
-              <w:rPr>
-                <w:sz w:val="18"/>
-                <w:szCs w:val="18"/>
-              </w:rPr>
               <w:br/>
               <w:t>(Aritmetik Ortalama)</w:t>
             </w:r>
@@ -2172,20 +1858,8 @@
                 <w:szCs w:val="18"/>
               </w:rPr>
               <w:t>%42</w:t>
-            </w:r>
-            <w:r>
-              <w:rPr>
-                <w:sz w:val="18"/>
-                <w:szCs w:val="18"/>
-              </w:rPr>
               <w:br/>
               <w:t>Pratik</w:t>
-            </w:r>
-            <w:r>
-              <w:rPr>
-                <w:sz w:val="18"/>
-                <w:szCs w:val="18"/>
-              </w:rPr>
               <w:br/>
               <w:t>(Uygulama Düzeyi)</w:t>
             </w:r>
@@ -2225,12 +1899,6 @@
                 <w:szCs w:val="18"/>
               </w:rPr>
               <w:t>Temrin</w:t>
-            </w:r>
-            <w:r>
-              <w:rPr>
-                <w:sz w:val="18"/>
-                <w:szCs w:val="18"/>
-              </w:rPr>
               <w:br/>
               <w:t>(Aritmetik Ortalama)</w:t>
             </w:r>
@@ -2275,20 +1943,8 @@
                 <w:szCs w:val="18"/>
               </w:rPr>
               <w:t>%42</w:t>
-            </w:r>
-            <w:r>
-              <w:rPr>
-                <w:sz w:val="18"/>
-                <w:szCs w:val="18"/>
-              </w:rPr>
               <w:br/>
               <w:t>Pratik</w:t>
-            </w:r>
-            <w:r>
-              <w:rPr>
-                <w:sz w:val="18"/>
-                <w:szCs w:val="18"/>
-              </w:rPr>
               <w:br/>
               <w:t>(Uygulama Düzeyi)</w:t>
             </w:r>
@@ -2328,12 +1984,6 @@
                 <w:szCs w:val="18"/>
               </w:rPr>
               <w:t>Temrin</w:t>
-            </w:r>
-            <w:r>
-              <w:rPr>
-                <w:sz w:val="18"/>
-                <w:szCs w:val="18"/>
-              </w:rPr>
               <w:br/>
               <w:t>(Aritmetik Ortalama)</w:t>
             </w:r>
@@ -2365,35 +2015,7 @@
                 <w:sz w:val="18"/>
                 <w:szCs w:val="18"/>
               </w:rPr>
-              <w:t>(</w:t>
-            </w:r>
-            <w:r>
-              <w:rPr>
-                <w:sz w:val="18"/>
-                <w:szCs w:val="18"/>
-              </w:rPr>
-              <w:t>A+B+C</w:t>
-            </w:r>
-            <w:r>
-              <w:rPr>
-                <w:sz w:val="18"/>
-                <w:szCs w:val="18"/>
-              </w:rPr>
-              <w:t xml:space="preserve">) </w:t>
-            </w:r>
-            <w:r>
-              <w:rPr>
-                <w:sz w:val="18"/>
-                <w:szCs w:val="18"/>
-              </w:rPr>
-              <w:t>/</w:t>
-            </w:r>
-            <w:r>
-              <w:rPr>
-                <w:sz w:val="18"/>
-                <w:szCs w:val="18"/>
-              </w:rPr>
-              <w:t>Modül Sayısı</w:t>
+              <w:t xml:space="preserve">(A+B+C) /Modül Sayısı</w:t>
             </w:r>
           </w:p>
         </w:tc>
@@ -3342,7 +2964,6 @@
           <w:szCs w:val="28"/>
         </w:rPr>
       </w:pPr>
-      <w:proofErr w:type="gramStart"/>
       <w:r>
         <w:rPr>
           <w:b/>
@@ -3350,17 +2971,7 @@
           <w:sz w:val="28"/>
           <w:szCs w:val="28"/>
         </w:rPr>
-        <w:t>Örnek :</w:t>
-      </w:r>
-      <w:proofErr w:type="gramEnd"/>
-      <w:r>
-        <w:rPr>
-          <w:b/>
-          <w:bCs/>
-          <w:sz w:val="28"/>
-          <w:szCs w:val="28"/>
-        </w:rPr>
-        <w:t xml:space="preserve"> </w:t>
+        <w:t xml:space="preserve">Örnek : </w:t>
       </w:r>
     </w:p>
     <w:p>
@@ -3452,19 +3063,7 @@
           <w:lang w:eastAsia="tr-TR"/>
           <w14:ligatures w14:val="none"/>
         </w:rPr>
-        <w:t xml:space="preserve">Teori = </w:t>
-      </w:r>
-      <w:r>
-        <w:rPr>
-          <w:rFonts w:ascii="Segoe UI" w:eastAsia="Times New Roman" w:hAnsi="Segoe UI" w:cs="Segoe UI"/>
-          <w:color w:val="0D0D0D"/>
-          <w:kern w:val="0"/>
-          <w:sz w:val="24"/>
-          <w:szCs w:val="24"/>
-          <w:lang w:eastAsia="tr-TR"/>
-          <w14:ligatures w14:val="none"/>
-        </w:rPr>
-        <w:t>80/100</w:t>
+        <w:t xml:space="preserve">Teori = 80/100</w:t>
       </w:r>
     </w:p>
     <w:p>
@@ -3526,43 +3125,7 @@
           <w:lang w:eastAsia="tr-TR"/>
           <w14:ligatures w14:val="none"/>
         </w:rPr>
-        <w:t>Temrin</w:t>
-      </w:r>
-      <w:r>
-        <w:rPr>
-          <w:rFonts w:ascii="Segoe UI" w:eastAsia="Times New Roman" w:hAnsi="Segoe UI" w:cs="Segoe UI"/>
-          <w:color w:val="0D0D0D"/>
-          <w:kern w:val="0"/>
-          <w:sz w:val="24"/>
-          <w:szCs w:val="24"/>
-          <w:lang w:eastAsia="tr-TR"/>
-          <w14:ligatures w14:val="none"/>
-        </w:rPr>
-        <w:t>lerin ortalaması</w:t>
-      </w:r>
-      <w:r>
-        <w:rPr>
-          <w:rFonts w:ascii="Segoe UI" w:eastAsia="Times New Roman" w:hAnsi="Segoe UI" w:cs="Segoe UI"/>
-          <w:color w:val="0D0D0D"/>
-          <w:kern w:val="0"/>
-          <w:sz w:val="24"/>
-          <w:szCs w:val="24"/>
-          <w:lang w:eastAsia="tr-TR"/>
-          <w14:ligatures w14:val="none"/>
-        </w:rPr>
-        <w:t xml:space="preserve"> = </w:t>
-      </w:r>
-      <w:r>
-        <w:rPr>
-          <w:rFonts w:ascii="Segoe UI" w:eastAsia="Times New Roman" w:hAnsi="Segoe UI" w:cs="Segoe UI"/>
-          <w:color w:val="0D0D0D"/>
-          <w:kern w:val="0"/>
-          <w:sz w:val="24"/>
-          <w:szCs w:val="24"/>
-          <w:lang w:eastAsia="tr-TR"/>
-          <w14:ligatures w14:val="none"/>
-        </w:rPr>
-        <w:t>90/100</w:t>
+        <w:t xml:space="preserve">Temrinlerin ortalaması = 90/100</w:t>
       </w:r>
     </w:p>
     <w:p/>
@@ -3614,19 +3177,7 @@
           <w:lang w:eastAsia="tr-TR"/>
           <w14:ligatures w14:val="none"/>
         </w:rPr>
-        <w:t xml:space="preserve">Teori: 80 × 0,30 = </w:t>
-      </w:r>
-      <w:r>
-        <w:rPr>
-          <w:rFonts w:ascii="Segoe UI" w:eastAsia="Times New Roman" w:hAnsi="Segoe UI" w:cs="Segoe UI"/>
-          <w:color w:val="0D0D0D"/>
-          <w:kern w:val="0"/>
-          <w:sz w:val="24"/>
-          <w:szCs w:val="24"/>
-          <w:lang w:eastAsia="tr-TR"/>
-          <w14:ligatures w14:val="none"/>
-        </w:rPr>
-        <w:t>24</w:t>
+        <w:t xml:space="preserve">Teori: 80 × 0,30 = 24</w:t>
       </w:r>
     </w:p>
     <w:p>
@@ -3771,9 +3322,14 @@
           <w:sz w:val="24"/>
           <w:szCs w:val="24"/>
         </w:rPr>
-        <w:t>Bir dönemdeki modüllerin ortalaması alındıktan sonra kar</w:t>
-      </w:r>
-      <w:r>
+        <w:t xml:space="preserve">Bir dönemdeki modüllerin ortalaması alındıktan sonra karne notu aşağıdaki gibi hesaplanır. </w:t>
+      </w:r>
+    </w:p>
+    <w:p>
+      <w:pPr>
+        <w:tabs>
+          <w:tab w:val="left" w:pos="1185"/>
+        </w:tabs>
         <w:rPr>
           <w:b/>
           <w:bCs/>
@@ -3782,8 +3338,7 @@
           <w:sz w:val="24"/>
           <w:szCs w:val="24"/>
         </w:rPr>
-        <w:t>n</w:t>
-      </w:r>
+      </w:pPr>
       <w:r>
         <w:rPr>
           <w:b/>
@@ -3793,7 +3348,51 @@
           <w:sz w:val="24"/>
           <w:szCs w:val="24"/>
         </w:rPr>
-        <w:t xml:space="preserve">e notu aşağıdaki gibi hesaplanır. </w:t>
+        <w:t xml:space="preserve">Karne Notu:( Ödev Notu*1+ Modül Ortalama Notu*5 )/6</w:t>
+      </w:r>
+    </w:p>
+    <w:p>
+      <w:pPr>
+        <w:tabs>
+          <w:tab w:val="left" w:pos="1185"/>
+        </w:tabs>
+        <w:rPr>
+          <w:i/>
+          <w:iCs/>
+          <w:sz w:val="24"/>
+          <w:szCs w:val="24"/>
+        </w:rPr>
+      </w:pPr>
+      <w:r>
+        <w:rPr>
+          <w:i/>
+          <w:iCs/>
+          <w:sz w:val="24"/>
+          <w:szCs w:val="24"/>
+        </w:rPr>
+        <w:t xml:space="preserve">Ödev Notu: 8</w:t>
+      </w:r>
+    </w:p>
+    <w:p>
+      <w:pPr>
+        <w:tabs>
+          <w:tab w:val="left" w:pos="1185"/>
+        </w:tabs>
+        <w:rPr>
+          <w:i/>
+          <w:iCs/>
+          <w:sz w:val="24"/>
+          <w:szCs w:val="24"/>
+        </w:rPr>
+      </w:pPr>
+      <w:r>
+        <w:rPr>
+          <w:i/>
+          <w:iCs/>
+          <w:sz w:val="24"/>
+          <w:szCs w:val="24"/>
+        </w:rPr>
+        <w:t xml:space="preserve">Modül Ortalama  Notu  ( Modül A+ Modül B+ Modül C Aritmetik ortalaması):6</w:t>
       </w:r>
     </w:p>
     <w:p>
@@ -3812,316 +3411,12 @@
       </w:pPr>
       <w:r>
         <w:rPr>
-          <w:b/>
-          <w:bCs/>
           <w:i/>
           <w:iCs/>
           <w:sz w:val="24"/>
           <w:szCs w:val="24"/>
         </w:rPr>
-        <w:t xml:space="preserve">Karne Notu:( Ödev Notu*1+ Modül </w:t>
-      </w:r>
-      <w:r>
-        <w:rPr>
-          <w:b/>
-          <w:bCs/>
-          <w:i/>
-          <w:iCs/>
-          <w:sz w:val="24"/>
-          <w:szCs w:val="24"/>
-        </w:rPr>
-        <w:t xml:space="preserve">Ortalama </w:t>
-      </w:r>
-      <w:r>
-        <w:rPr>
-          <w:b/>
-          <w:bCs/>
-          <w:i/>
-          <w:iCs/>
-          <w:sz w:val="24"/>
-          <w:szCs w:val="24"/>
-        </w:rPr>
-        <w:t>Notu*</w:t>
-      </w:r>
-      <w:proofErr w:type="gramStart"/>
-      <w:r>
-        <w:rPr>
-          <w:b/>
-          <w:bCs/>
-          <w:i/>
-          <w:iCs/>
-          <w:sz w:val="24"/>
-          <w:szCs w:val="24"/>
-        </w:rPr>
-        <w:t>5 )</w:t>
-      </w:r>
-      <w:proofErr w:type="gramEnd"/>
-      <w:r>
-        <w:rPr>
-          <w:b/>
-          <w:bCs/>
-          <w:i/>
-          <w:iCs/>
-          <w:sz w:val="24"/>
-          <w:szCs w:val="24"/>
-        </w:rPr>
-        <w:t>/6</w:t>
-      </w:r>
-    </w:p>
-    <w:p>
-      <w:pPr>
-        <w:tabs>
-          <w:tab w:val="left" w:pos="1185"/>
-        </w:tabs>
-        <w:rPr>
-          <w:i/>
-          <w:iCs/>
-          <w:sz w:val="24"/>
-          <w:szCs w:val="24"/>
-        </w:rPr>
-      </w:pPr>
-      <w:r>
-        <w:rPr>
-          <w:i/>
-          <w:iCs/>
-          <w:sz w:val="24"/>
-          <w:szCs w:val="24"/>
-        </w:rPr>
-        <w:t>Ödev Notu</w:t>
-      </w:r>
-      <w:r>
-        <w:rPr>
-          <w:i/>
-          <w:iCs/>
-          <w:sz w:val="24"/>
-          <w:szCs w:val="24"/>
-        </w:rPr>
-        <w:t xml:space="preserve">: </w:t>
-      </w:r>
-      <w:r>
-        <w:rPr>
-          <w:i/>
-          <w:iCs/>
-          <w:sz w:val="24"/>
-          <w:szCs w:val="24"/>
-        </w:rPr>
-        <w:t>8</w:t>
-      </w:r>
-    </w:p>
-    <w:p>
-      <w:pPr>
-        <w:tabs>
-          <w:tab w:val="left" w:pos="1185"/>
-        </w:tabs>
-        <w:rPr>
-          <w:i/>
-          <w:iCs/>
-          <w:sz w:val="24"/>
-          <w:szCs w:val="24"/>
-        </w:rPr>
-      </w:pPr>
-      <w:r>
-        <w:rPr>
-          <w:i/>
-          <w:iCs/>
-          <w:sz w:val="24"/>
-          <w:szCs w:val="24"/>
-        </w:rPr>
-        <w:t>Modül</w:t>
-      </w:r>
-      <w:r>
-        <w:rPr>
-          <w:i/>
-          <w:iCs/>
-          <w:sz w:val="24"/>
-          <w:szCs w:val="24"/>
-        </w:rPr>
-        <w:t xml:space="preserve"> </w:t>
-      </w:r>
-      <w:proofErr w:type="gramStart"/>
-      <w:r>
-        <w:rPr>
-          <w:i/>
-          <w:iCs/>
-          <w:sz w:val="24"/>
-          <w:szCs w:val="24"/>
-        </w:rPr>
-        <w:t xml:space="preserve">Ortalama </w:t>
-      </w:r>
-      <w:r>
-        <w:rPr>
-          <w:i/>
-          <w:iCs/>
-          <w:sz w:val="24"/>
-          <w:szCs w:val="24"/>
-        </w:rPr>
-        <w:t xml:space="preserve"> Notu</w:t>
-      </w:r>
-      <w:proofErr w:type="gramEnd"/>
-      <w:r>
-        <w:rPr>
-          <w:i/>
-          <w:iCs/>
-          <w:sz w:val="24"/>
-          <w:szCs w:val="24"/>
-        </w:rPr>
-        <w:t xml:space="preserve"> </w:t>
-      </w:r>
-      <w:r>
-        <w:rPr>
-          <w:i/>
-          <w:iCs/>
-          <w:sz w:val="24"/>
-          <w:szCs w:val="24"/>
-        </w:rPr>
-        <w:t xml:space="preserve"> </w:t>
-      </w:r>
-      <w:proofErr w:type="gramStart"/>
-      <w:r>
-        <w:rPr>
-          <w:i/>
-          <w:iCs/>
-          <w:sz w:val="24"/>
-          <w:szCs w:val="24"/>
-        </w:rPr>
-        <w:t>( Modül</w:t>
-      </w:r>
-      <w:proofErr w:type="gramEnd"/>
-      <w:r>
-        <w:rPr>
-          <w:i/>
-          <w:iCs/>
-          <w:sz w:val="24"/>
-          <w:szCs w:val="24"/>
-        </w:rPr>
-        <w:t xml:space="preserve"> A+ Modül B+ Modül C </w:t>
-      </w:r>
-      <w:r>
-        <w:rPr>
-          <w:i/>
-          <w:iCs/>
-          <w:sz w:val="24"/>
-          <w:szCs w:val="24"/>
-        </w:rPr>
-        <w:t xml:space="preserve">Aritmetik </w:t>
-      </w:r>
-      <w:r>
-        <w:rPr>
-          <w:i/>
-          <w:iCs/>
-          <w:sz w:val="24"/>
-          <w:szCs w:val="24"/>
-        </w:rPr>
-        <w:t>ortalaması)</w:t>
-      </w:r>
-      <w:r>
-        <w:rPr>
-          <w:i/>
-          <w:iCs/>
-          <w:sz w:val="24"/>
-          <w:szCs w:val="24"/>
-        </w:rPr>
-        <w:t>:</w:t>
-      </w:r>
-      <w:r>
-        <w:rPr>
-          <w:i/>
-          <w:iCs/>
-          <w:sz w:val="24"/>
-          <w:szCs w:val="24"/>
-        </w:rPr>
-        <w:t>6</w:t>
-      </w:r>
-    </w:p>
-    <w:p>
-      <w:pPr>
-        <w:tabs>
-          <w:tab w:val="left" w:pos="1185"/>
-        </w:tabs>
-        <w:rPr>
-          <w:b/>
-          <w:bCs/>
-          <w:i/>
-          <w:iCs/>
-          <w:sz w:val="24"/>
-          <w:szCs w:val="24"/>
-        </w:rPr>
-      </w:pPr>
-      <w:r>
-        <w:rPr>
-          <w:i/>
-          <w:iCs/>
-          <w:sz w:val="24"/>
-          <w:szCs w:val="24"/>
-        </w:rPr>
-        <w:t xml:space="preserve">Karne Notu= </w:t>
-      </w:r>
-      <w:proofErr w:type="gramStart"/>
-      <w:r>
-        <w:rPr>
-          <w:i/>
-          <w:iCs/>
-          <w:sz w:val="24"/>
-          <w:szCs w:val="24"/>
-        </w:rPr>
-        <w:t>( 8</w:t>
-      </w:r>
-      <w:proofErr w:type="gramEnd"/>
-      <w:r>
-        <w:rPr>
-          <w:i/>
-          <w:iCs/>
-          <w:sz w:val="24"/>
-          <w:szCs w:val="24"/>
-        </w:rPr>
-        <w:t>*1+</w:t>
-      </w:r>
-      <w:r>
-        <w:rPr>
-          <w:i/>
-          <w:iCs/>
-          <w:sz w:val="24"/>
-          <w:szCs w:val="24"/>
-        </w:rPr>
-        <w:t>6</w:t>
-      </w:r>
-      <w:r>
-        <w:rPr>
-          <w:i/>
-          <w:iCs/>
-          <w:sz w:val="24"/>
-          <w:szCs w:val="24"/>
-        </w:rPr>
-        <w:t>*</w:t>
-      </w:r>
-      <w:proofErr w:type="gramStart"/>
-      <w:r>
-        <w:rPr>
-          <w:i/>
-          <w:iCs/>
-          <w:sz w:val="24"/>
-          <w:szCs w:val="24"/>
-        </w:rPr>
-        <w:t>5)/</w:t>
-      </w:r>
-      <w:proofErr w:type="gramEnd"/>
-      <w:r>
-        <w:rPr>
-          <w:i/>
-          <w:iCs/>
-          <w:sz w:val="24"/>
-          <w:szCs w:val="24"/>
-        </w:rPr>
-        <w:t>6=</w:t>
-      </w:r>
-      <w:r>
-        <w:rPr>
-          <w:i/>
-          <w:iCs/>
-          <w:sz w:val="24"/>
-          <w:szCs w:val="24"/>
-        </w:rPr>
-        <w:t>6,3=6</w:t>
+        <w:t xml:space="preserve">Karne Notu= ( 8*1+6*5)/6=6,3=6</w:t>
       </w:r>
     </w:p>
     <w:p>

</xml_diff>